<commit_message>
CPI test data: child LIFNR always mapped, link node not used
Co-Authored-By: Claude Opus 5.5 <noreply@anthropic.com>
Claude-Session: https://claude.ai/code/session_01GFQC8seK63uGrRVoGnYFVd
</commit_message>
<xml_diff>
--- a/ZOVL_VENDOR_SYNC_CPI_Test_Data.docx
+++ b/ZOVL_VENDOR_SYNC_CPI_Test_Data.docx
@@ -1105,7 +1105,63 @@
           <w:sz w:val="21"/>
           <w:szCs w:val="21"/>
         </w:rPr>
-        <w:t xml:space="preserve">may be omitted or sent empty. LIFNR inside CompanyCode / Bank may be omitted – the vendor LIFNR is used.</w:t>
+        <w:t xml:space="preserve">may be omitted or sent empty.</w:t>
+      </w:r>
+    </w:p>
+    <w:p>
+      <w:pPr>
+        <w:pStyle w:val="ListParagraph"/>
+        <w:numPr>
+          <w:ilvl w:val="0"/>
+          <w:numId w:val="2"/>
+        </w:numPr>
+        <w:spacing w:after="60"/>
+      </w:pPr>
+      <w:r>
+        <w:rPr>
+          <w:rFonts w:ascii="Calibri" w:cs="Calibri" w:eastAsia="Calibri" w:hAnsi="Calibri"/>
+          <w:b/>
+          <w:bCs/>
+          <w:sz w:val="21"/>
+          <w:szCs w:val="21"/>
+        </w:rPr>
+        <w:t xml:space="preserve">Key fields are mandatory in the CPI-generated XSD: </w:t>
+      </w:r>
+      <w:r>
+        <w:rPr>
+          <w:rFonts w:ascii="Calibri" w:cs="Calibri" w:eastAsia="Calibri" w:hAnsi="Calibri"/>
+          <w:sz w:val="21"/>
+          <w:szCs w:val="21"/>
+        </w:rPr>
+        <w:t xml:space="preserve">Vendor/LIFNR; CompanyCode/LIFNR + BUKRS; Bank/LIFNR + BANKS + BANKL + BANKN. Always map the vendor LIFNR into the LIFNR of every CompanyCode and Bank row.</w:t>
+      </w:r>
+    </w:p>
+    <w:p>
+      <w:pPr>
+        <w:pStyle w:val="ListParagraph"/>
+        <w:numPr>
+          <w:ilvl w:val="0"/>
+          <w:numId w:val="2"/>
+        </w:numPr>
+        <w:spacing w:after="60"/>
+      </w:pPr>
+      <w:r>
+        <w:rPr>
+          <w:rFonts w:ascii="Calibri" w:cs="Calibri" w:eastAsia="Calibri" w:hAnsi="Calibri"/>
+          <w:b/>
+          <w:bCs/>
+          <w:sz w:val="21"/>
+          <w:szCs w:val="21"/>
+        </w:rPr>
+        <w:t xml:space="preserve">&lt;link&gt; in the CPI-generated XSD </w:t>
+      </w:r>
+      <w:r>
+        <w:rPr>
+          <w:rFonts w:ascii="Calibri" w:cs="Calibri" w:eastAsia="Calibri" w:hAnsi="Calibri"/>
+          <w:sz w:val="21"/>
+          <w:szCs w:val="21"/>
+        </w:rPr>
+        <w:t xml:space="preserve">is for linking to already existing entities by key – it is NOT used for this interface. Leave it unmapped; company code and bank are created via the direct ToCompanyCode / ToBank nodes (deep insert).</w:t>
       </w:r>
     </w:p>
     <w:p>
@@ -3409,6 +3465,24 @@
           <w:sz w:val="17"/>
           <w:szCs w:val="17"/>
         </w:rPr>
+        <w:t xml:space="preserve">        &lt;LIFNR&gt;0000712345&lt;/LIFNR&gt;</w:t>
+      </w:r>
+    </w:p>
+    <w:p>
+      <w:pPr>
+        <w:pBdr>
+          <w:left w:val="single" w:color="1F4E79" w:sz="12" w:space="6"/>
+        </w:pBdr>
+        <w:shd w:fill="F2F2F2" w:color="auto" w:val="clear"/>
+        <w:spacing w:after="0" w:before="0" w:line="240"/>
+        <w:ind w:left="120"/>
+      </w:pPr>
+      <w:r>
+        <w:rPr>
+          <w:rFonts w:ascii="Consolas" w:cs="Consolas" w:eastAsia="Consolas" w:hAnsi="Consolas"/>
+          <w:sz w:val="17"/>
+          <w:szCs w:val="17"/>
+        </w:rPr>
         <w:t xml:space="preserve">        &lt;BUKRS&gt;OVL&lt;/BUKRS&gt;</w:t>
       </w:r>
     </w:p>
@@ -3518,6 +3592,24 @@
           <w:szCs w:val="17"/>
         </w:rPr>
         <w:t xml:space="preserve">      &lt;Bank&gt;</w:t>
+      </w:r>
+    </w:p>
+    <w:p>
+      <w:pPr>
+        <w:pBdr>
+          <w:left w:val="single" w:color="1F4E79" w:sz="12" w:space="6"/>
+        </w:pBdr>
+        <w:shd w:fill="F2F2F2" w:color="auto" w:val="clear"/>
+        <w:spacing w:after="0" w:before="0" w:line="240"/>
+        <w:ind w:left="120"/>
+      </w:pPr>
+      <w:r>
+        <w:rPr>
+          <w:rFonts w:ascii="Consolas" w:cs="Consolas" w:eastAsia="Consolas" w:hAnsi="Consolas"/>
+          <w:sz w:val="17"/>
+          <w:szCs w:val="17"/>
+        </w:rPr>
+        <w:t xml:space="preserve">        &lt;LIFNR&gt;0000712345&lt;/LIFNR&gt;</w:t>
       </w:r>
     </w:p>
     <w:p>
@@ -3990,6 +4082,24 @@
           <w:sz w:val="17"/>
           <w:szCs w:val="17"/>
         </w:rPr>
+        <w:t xml:space="preserve">        &lt;LIFNR&gt;0000712346&lt;/LIFNR&gt;</w:t>
+      </w:r>
+    </w:p>
+    <w:p>
+      <w:pPr>
+        <w:pBdr>
+          <w:left w:val="single" w:color="1F4E79" w:sz="12" w:space="6"/>
+        </w:pBdr>
+        <w:shd w:fill="F2F2F2" w:color="auto" w:val="clear"/>
+        <w:spacing w:after="0" w:before="0" w:line="240"/>
+        <w:ind w:left="120"/>
+      </w:pPr>
+      <w:r>
+        <w:rPr>
+          <w:rFonts w:ascii="Consolas" w:cs="Consolas" w:eastAsia="Consolas" w:hAnsi="Consolas"/>
+          <w:sz w:val="17"/>
+          <w:szCs w:val="17"/>
+        </w:rPr>
         <w:t xml:space="preserve">        &lt;BUKRS&gt;OVL&lt;/BUKRS&gt;</w:t>
       </w:r>
     </w:p>
@@ -4391,6 +4501,24 @@
           <w:sz w:val="17"/>
           <w:szCs w:val="17"/>
         </w:rPr>
+        <w:t xml:space="preserve">        &lt;LIFNR&gt;0000712347&lt;/LIFNR&gt;</w:t>
+      </w:r>
+    </w:p>
+    <w:p>
+      <w:pPr>
+        <w:pBdr>
+          <w:left w:val="single" w:color="1F4E79" w:sz="12" w:space="6"/>
+        </w:pBdr>
+        <w:shd w:fill="F2F2F2" w:color="auto" w:val="clear"/>
+        <w:spacing w:after="0" w:before="0" w:line="240"/>
+        <w:ind w:left="120"/>
+      </w:pPr>
+      <w:r>
+        <w:rPr>
+          <w:rFonts w:ascii="Consolas" w:cs="Consolas" w:eastAsia="Consolas" w:hAnsi="Consolas"/>
+          <w:sz w:val="17"/>
+          <w:szCs w:val="17"/>
+        </w:rPr>
         <w:t xml:space="preserve">        &lt;BUKRS&gt;OVL&lt;/BUKRS&gt;</w:t>
       </w:r>
     </w:p>
@@ -4482,6 +4610,24 @@
           <w:szCs w:val="17"/>
         </w:rPr>
         <w:t xml:space="preserve">      &lt;Bank&gt;</w:t>
+      </w:r>
+    </w:p>
+    <w:p>
+      <w:pPr>
+        <w:pBdr>
+          <w:left w:val="single" w:color="1F4E79" w:sz="12" w:space="6"/>
+        </w:pBdr>
+        <w:shd w:fill="F2F2F2" w:color="auto" w:val="clear"/>
+        <w:spacing w:after="0" w:before="0" w:line="240"/>
+        <w:ind w:left="120"/>
+      </w:pPr>
+      <w:r>
+        <w:rPr>
+          <w:rFonts w:ascii="Consolas" w:cs="Consolas" w:eastAsia="Consolas" w:hAnsi="Consolas"/>
+          <w:sz w:val="17"/>
+          <w:szCs w:val="17"/>
+        </w:rPr>
+        <w:t xml:space="preserve">        &lt;LIFNR&gt;0000712347&lt;/LIFNR&gt;</w:t>
       </w:r>
     </w:p>
     <w:p>
@@ -4883,6 +5029,24 @@
           <w:szCs w:val="17"/>
         </w:rPr>
         <w:t xml:space="preserve">      &lt;CompanyCode&gt;</w:t>
+      </w:r>
+    </w:p>
+    <w:p>
+      <w:pPr>
+        <w:pBdr>
+          <w:left w:val="single" w:color="1F4E79" w:sz="12" w:space="6"/>
+        </w:pBdr>
+        <w:shd w:fill="F2F2F2" w:color="auto" w:val="clear"/>
+        <w:spacing w:after="0" w:before="0" w:line="240"/>
+        <w:ind w:left="120"/>
+      </w:pPr>
+      <w:r>
+        <w:rPr>
+          <w:rFonts w:ascii="Consolas" w:cs="Consolas" w:eastAsia="Consolas" w:hAnsi="Consolas"/>
+          <w:sz w:val="17"/>
+          <w:szCs w:val="17"/>
+        </w:rPr>
+        <w:t xml:space="preserve">        &lt;LIFNR&gt;0000712348&lt;/LIFNR&gt;</w:t>
       </w:r>
     </w:p>
     <w:p>

</xml_diff>

<commit_message>
CPI test data: show real Atom XML response format and how to read STATUS/MESSAGE
Co-Authored-By: Claude Opus 5.5 <noreply@anthropic.com>
Claude-Session: https://claude.ai/code/session_01GFQC8seK63uGrRVoGnYFVd
</commit_message>
<xml_diff>
--- a/ZOVL_VENDOR_SYNC_CPI_Test_Data.docx
+++ b/ZOVL_VENDOR_SYNC_CPI_Test_Data.docx
@@ -5276,25 +5276,493 @@
           <w:sz w:val="17"/>
           <w:szCs w:val="17"/>
         </w:rPr>
-        <w:t xml:space="preserve">HTTP 201 Created</w:t>
-      </w:r>
-    </w:p>
-    <w:p>
-      <w:pPr>
-        <w:pBdr>
-          <w:left w:val="single" w:color="1F4E79" w:sz="12" w:space="6"/>
-        </w:pBdr>
-        <w:shd w:fill="F2F2F2" w:color="auto" w:val="clear"/>
-        <w:spacing w:after="0" w:before="0" w:line="240"/>
-        <w:ind w:left="120"/>
-      </w:pPr>
-      <w:r>
-        <w:rPr>
-          <w:rFonts w:ascii="Consolas" w:cs="Consolas" w:eastAsia="Consolas" w:hAnsi="Consolas"/>
-          <w:sz w:val="17"/>
-          <w:szCs w:val="17"/>
-        </w:rPr>
-        <w:t xml:space="preserve">{ "d": { "LIFNR": "0000712345", ..., "STATUS": "S", "ACTION": "CREATE",</w:t>
+        <w:t xml:space="preserve">HTTP 201 Created   (Content-Type: application/atom+xml)</w:t>
+      </w:r>
+    </w:p>
+    <w:p>
+      <w:pPr>
+        <w:pBdr>
+          <w:left w:val="single" w:color="1F4E79" w:sz="12" w:space="6"/>
+        </w:pBdr>
+        <w:shd w:fill="F2F2F2" w:color="auto" w:val="clear"/>
+        <w:spacing w:after="0" w:before="0" w:line="240"/>
+        <w:ind w:left="120"/>
+      </w:pPr>
+      <w:r>
+        <w:rPr>
+          <w:rFonts w:ascii="Consolas" w:cs="Consolas" w:eastAsia="Consolas" w:hAnsi="Consolas"/>
+          <w:sz w:val="17"/>
+          <w:szCs w:val="17"/>
+        </w:rPr>
+        <w:t xml:space="preserve"> </w:t>
+      </w:r>
+    </w:p>
+    <w:p>
+      <w:pPr>
+        <w:pBdr>
+          <w:left w:val="single" w:color="1F4E79" w:sz="12" w:space="6"/>
+        </w:pBdr>
+        <w:shd w:fill="F2F2F2" w:color="auto" w:val="clear"/>
+        <w:spacing w:after="0" w:before="0" w:line="240"/>
+        <w:ind w:left="120"/>
+      </w:pPr>
+      <w:r>
+        <w:rPr>
+          <w:rFonts w:ascii="Consolas" w:cs="Consolas" w:eastAsia="Consolas" w:hAnsi="Consolas"/>
+          <w:sz w:val="17"/>
+          <w:szCs w:val="17"/>
+        </w:rPr>
+        <w:t xml:space="preserve">&lt;entry xmlns="http://www.w3.org/2005/Atom"</w:t>
+      </w:r>
+    </w:p>
+    <w:p>
+      <w:pPr>
+        <w:pBdr>
+          <w:left w:val="single" w:color="1F4E79" w:sz="12" w:space="6"/>
+        </w:pBdr>
+        <w:shd w:fill="F2F2F2" w:color="auto" w:val="clear"/>
+        <w:spacing w:after="0" w:before="0" w:line="240"/>
+        <w:ind w:left="120"/>
+      </w:pPr>
+      <w:r>
+        <w:rPr>
+          <w:rFonts w:ascii="Consolas" w:cs="Consolas" w:eastAsia="Consolas" w:hAnsi="Consolas"/>
+          <w:sz w:val="17"/>
+          <w:szCs w:val="17"/>
+        </w:rPr>
+        <w:t xml:space="preserve">       xmlns:m="http://schemas.microsoft.com/ado/2007/08/dataservices/metadata"</w:t>
+      </w:r>
+    </w:p>
+    <w:p>
+      <w:pPr>
+        <w:pBdr>
+          <w:left w:val="single" w:color="1F4E79" w:sz="12" w:space="6"/>
+        </w:pBdr>
+        <w:shd w:fill="F2F2F2" w:color="auto" w:val="clear"/>
+        <w:spacing w:after="0" w:before="0" w:line="240"/>
+        <w:ind w:left="120"/>
+      </w:pPr>
+      <w:r>
+        <w:rPr>
+          <w:rFonts w:ascii="Consolas" w:cs="Consolas" w:eastAsia="Consolas" w:hAnsi="Consolas"/>
+          <w:sz w:val="17"/>
+          <w:szCs w:val="17"/>
+        </w:rPr>
+        <w:t xml:space="preserve">       xmlns:d="http://schemas.microsoft.com/ado/2007/08/dataservices" ...&gt;</w:t>
+      </w:r>
+    </w:p>
+    <w:p>
+      <w:pPr>
+        <w:pBdr>
+          <w:left w:val="single" w:color="1F4E79" w:sz="12" w:space="6"/>
+        </w:pBdr>
+        <w:shd w:fill="F2F2F2" w:color="auto" w:val="clear"/>
+        <w:spacing w:after="0" w:before="0" w:line="240"/>
+        <w:ind w:left="120"/>
+      </w:pPr>
+      <w:r>
+        <w:rPr>
+          <w:rFonts w:ascii="Consolas" w:cs="Consolas" w:eastAsia="Consolas" w:hAnsi="Consolas"/>
+          <w:sz w:val="17"/>
+          <w:szCs w:val="17"/>
+        </w:rPr>
+        <w:t xml:space="preserve">  &lt;id&gt;.../ZOVL_VENDOR_SYNC_SRV/VendorSet('0007010857')&lt;/id&gt;</w:t>
+      </w:r>
+    </w:p>
+    <w:p>
+      <w:pPr>
+        <w:pBdr>
+          <w:left w:val="single" w:color="1F4E79" w:sz="12" w:space="6"/>
+        </w:pBdr>
+        <w:shd w:fill="F2F2F2" w:color="auto" w:val="clear"/>
+        <w:spacing w:after="0" w:before="0" w:line="240"/>
+        <w:ind w:left="120"/>
+      </w:pPr>
+      <w:r>
+        <w:rPr>
+          <w:rFonts w:ascii="Consolas" w:cs="Consolas" w:eastAsia="Consolas" w:hAnsi="Consolas"/>
+          <w:sz w:val="17"/>
+          <w:szCs w:val="17"/>
+        </w:rPr>
+        <w:t xml:space="preserve">  ...</w:t>
+      </w:r>
+    </w:p>
+    <w:p>
+      <w:pPr>
+        <w:pBdr>
+          <w:left w:val="single" w:color="1F4E79" w:sz="12" w:space="6"/>
+        </w:pBdr>
+        <w:shd w:fill="F2F2F2" w:color="auto" w:val="clear"/>
+        <w:spacing w:after="0" w:before="0" w:line="240"/>
+        <w:ind w:left="120"/>
+      </w:pPr>
+      <w:r>
+        <w:rPr>
+          <w:rFonts w:ascii="Consolas" w:cs="Consolas" w:eastAsia="Consolas" w:hAnsi="Consolas"/>
+          <w:sz w:val="17"/>
+          <w:szCs w:val="17"/>
+        </w:rPr>
+        <w:t xml:space="preserve">  &lt;link href="VendorSet('0007010857')/ToCompanyCode" ...&gt;&lt;m:inline&gt;&lt;feed&gt;...&lt;/feed&gt;&lt;/m:inline&gt;&lt;/link&gt;</w:t>
+      </w:r>
+    </w:p>
+    <w:p>
+      <w:pPr>
+        <w:pBdr>
+          <w:left w:val="single" w:color="1F4E79" w:sz="12" w:space="6"/>
+        </w:pBdr>
+        <w:shd w:fill="F2F2F2" w:color="auto" w:val="clear"/>
+        <w:spacing w:after="0" w:before="0" w:line="240"/>
+        <w:ind w:left="120"/>
+      </w:pPr>
+      <w:r>
+        <w:rPr>
+          <w:rFonts w:ascii="Consolas" w:cs="Consolas" w:eastAsia="Consolas" w:hAnsi="Consolas"/>
+          <w:sz w:val="17"/>
+          <w:szCs w:val="17"/>
+        </w:rPr>
+        <w:t xml:space="preserve">  &lt;link href="VendorSet('0007010857')/ToBank" ...&gt;&lt;m:inline&gt;&lt;feed&gt;...&lt;/feed&gt;&lt;/m:inline&gt;&lt;/link&gt;</w:t>
+      </w:r>
+    </w:p>
+    <w:p>
+      <w:pPr>
+        <w:pBdr>
+          <w:left w:val="single" w:color="1F4E79" w:sz="12" w:space="6"/>
+        </w:pBdr>
+        <w:shd w:fill="F2F2F2" w:color="auto" w:val="clear"/>
+        <w:spacing w:after="0" w:before="0" w:line="240"/>
+        <w:ind w:left="120"/>
+      </w:pPr>
+      <w:r>
+        <w:rPr>
+          <w:rFonts w:ascii="Consolas" w:cs="Consolas" w:eastAsia="Consolas" w:hAnsi="Consolas"/>
+          <w:sz w:val="17"/>
+          <w:szCs w:val="17"/>
+        </w:rPr>
+        <w:t xml:space="preserve">  &lt;content type="application/xml"&gt;</w:t>
+      </w:r>
+    </w:p>
+    <w:p>
+      <w:pPr>
+        <w:pBdr>
+          <w:left w:val="single" w:color="1F4E79" w:sz="12" w:space="6"/>
+        </w:pBdr>
+        <w:shd w:fill="F2F2F2" w:color="auto" w:val="clear"/>
+        <w:spacing w:after="0" w:before="0" w:line="240"/>
+        <w:ind w:left="120"/>
+      </w:pPr>
+      <w:r>
+        <w:rPr>
+          <w:rFonts w:ascii="Consolas" w:cs="Consolas" w:eastAsia="Consolas" w:hAnsi="Consolas"/>
+          <w:sz w:val="17"/>
+          <w:szCs w:val="17"/>
+        </w:rPr>
+        <w:t xml:space="preserve">    &lt;m:properties&gt;</w:t>
+      </w:r>
+    </w:p>
+    <w:p>
+      <w:pPr>
+        <w:pBdr>
+          <w:left w:val="single" w:color="1F4E79" w:sz="12" w:space="6"/>
+        </w:pBdr>
+        <w:shd w:fill="F2F2F2" w:color="auto" w:val="clear"/>
+        <w:spacing w:after="0" w:before="0" w:line="240"/>
+        <w:ind w:left="120"/>
+      </w:pPr>
+      <w:r>
+        <w:rPr>
+          <w:rFonts w:ascii="Consolas" w:cs="Consolas" w:eastAsia="Consolas" w:hAnsi="Consolas"/>
+          <w:sz w:val="17"/>
+          <w:szCs w:val="17"/>
+        </w:rPr>
+        <w:t xml:space="preserve">      &lt;d:LIFNR&gt;0007010857&lt;/d:LIFNR&gt;</w:t>
+      </w:r>
+    </w:p>
+    <w:p>
+      <w:pPr>
+        <w:pBdr>
+          <w:left w:val="single" w:color="1F4E79" w:sz="12" w:space="6"/>
+        </w:pBdr>
+        <w:shd w:fill="F2F2F2" w:color="auto" w:val="clear"/>
+        <w:spacing w:after="0" w:before="0" w:line="240"/>
+        <w:ind w:left="120"/>
+      </w:pPr>
+      <w:r>
+        <w:rPr>
+          <w:rFonts w:ascii="Consolas" w:cs="Consolas" w:eastAsia="Consolas" w:hAnsi="Consolas"/>
+          <w:sz w:val="17"/>
+          <w:szCs w:val="17"/>
+        </w:rPr>
+        <w:t xml:space="preserve">      &lt;d:LAND1&gt;IN&lt;/d:LAND1&gt;</w:t>
+      </w:r>
+    </w:p>
+    <w:p>
+      <w:pPr>
+        <w:pBdr>
+          <w:left w:val="single" w:color="1F4E79" w:sz="12" w:space="6"/>
+        </w:pBdr>
+        <w:shd w:fill="F2F2F2" w:color="auto" w:val="clear"/>
+        <w:spacing w:after="0" w:before="0" w:line="240"/>
+        <w:ind w:left="120"/>
+      </w:pPr>
+      <w:r>
+        <w:rPr>
+          <w:rFonts w:ascii="Consolas" w:cs="Consolas" w:eastAsia="Consolas" w:hAnsi="Consolas"/>
+          <w:sz w:val="17"/>
+          <w:szCs w:val="17"/>
+        </w:rPr>
+        <w:t xml:space="preserve">      &lt;d:NAME1&gt;HARENDRAPRASAD M YAGNIK&lt;/d:NAME1&gt;</w:t>
+      </w:r>
+    </w:p>
+    <w:p>
+      <w:pPr>
+        <w:pBdr>
+          <w:left w:val="single" w:color="1F4E79" w:sz="12" w:space="6"/>
+        </w:pBdr>
+        <w:shd w:fill="F2F2F2" w:color="auto" w:val="clear"/>
+        <w:spacing w:after="0" w:before="0" w:line="240"/>
+        <w:ind w:left="120"/>
+      </w:pPr>
+      <w:r>
+        <w:rPr>
+          <w:rFonts w:ascii="Consolas" w:cs="Consolas" w:eastAsia="Consolas" w:hAnsi="Consolas"/>
+          <w:sz w:val="17"/>
+          <w:szCs w:val="17"/>
+        </w:rPr>
+        <w:t xml:space="preserve">      ...</w:t>
+      </w:r>
+    </w:p>
+    <w:p>
+      <w:pPr>
+        <w:pBdr>
+          <w:left w:val="single" w:color="1F4E79" w:sz="12" w:space="6"/>
+        </w:pBdr>
+        <w:shd w:fill="F2F2F2" w:color="auto" w:val="clear"/>
+        <w:spacing w:after="0" w:before="0" w:line="240"/>
+        <w:ind w:left="120"/>
+      </w:pPr>
+      <w:r>
+        <w:rPr>
+          <w:rFonts w:ascii="Consolas" w:cs="Consolas" w:eastAsia="Consolas" w:hAnsi="Consolas"/>
+          <w:sz w:val="17"/>
+          <w:szCs w:val="17"/>
+        </w:rPr>
+        <w:t xml:space="preserve">      &lt;d:STATUS&gt;S&lt;/d:STATUS&gt;</w:t>
+      </w:r>
+    </w:p>
+    <w:p>
+      <w:pPr>
+        <w:pBdr>
+          <w:left w:val="single" w:color="1F4E79" w:sz="12" w:space="6"/>
+        </w:pBdr>
+        <w:shd w:fill="F2F2F2" w:color="auto" w:val="clear"/>
+        <w:spacing w:after="0" w:before="0" w:line="240"/>
+        <w:ind w:left="120"/>
+      </w:pPr>
+      <w:r>
+        <w:rPr>
+          <w:rFonts w:ascii="Consolas" w:cs="Consolas" w:eastAsia="Consolas" w:hAnsi="Consolas"/>
+          <w:sz w:val="17"/>
+          <w:szCs w:val="17"/>
+        </w:rPr>
+        <w:t xml:space="preserve">      &lt;d:ACTION&gt;CREATE&lt;/d:ACTION&gt;</w:t>
+      </w:r>
+    </w:p>
+    <w:p>
+      <w:pPr>
+        <w:pBdr>
+          <w:left w:val="single" w:color="1F4E79" w:sz="12" w:space="6"/>
+        </w:pBdr>
+        <w:shd w:fill="F2F2F2" w:color="auto" w:val="clear"/>
+        <w:spacing w:after="0" w:before="0" w:line="240"/>
+        <w:ind w:left="120"/>
+      </w:pPr>
+      <w:r>
+        <w:rPr>
+          <w:rFonts w:ascii="Consolas" w:cs="Consolas" w:eastAsia="Consolas" w:hAnsi="Consolas"/>
+          <w:sz w:val="17"/>
+          <w:szCs w:val="17"/>
+        </w:rPr>
+        <w:t xml:space="preserve">      &lt;d:MESSAGE&gt;Vendor 7010857 created in company code OVL.&lt;/d:MESSAGE&gt;</w:t>
+      </w:r>
+    </w:p>
+    <w:p>
+      <w:pPr>
+        <w:pBdr>
+          <w:left w:val="single" w:color="1F4E79" w:sz="12" w:space="6"/>
+        </w:pBdr>
+        <w:shd w:fill="F2F2F2" w:color="auto" w:val="clear"/>
+        <w:spacing w:after="0" w:before="0" w:line="240"/>
+        <w:ind w:left="120"/>
+      </w:pPr>
+      <w:r>
+        <w:rPr>
+          <w:rFonts w:ascii="Consolas" w:cs="Consolas" w:eastAsia="Consolas" w:hAnsi="Consolas"/>
+          <w:sz w:val="17"/>
+          <w:szCs w:val="17"/>
+        </w:rPr>
+        <w:t xml:space="preserve">    &lt;/m:properties&gt;</w:t>
+      </w:r>
+    </w:p>
+    <w:p>
+      <w:pPr>
+        <w:pBdr>
+          <w:left w:val="single" w:color="1F4E79" w:sz="12" w:space="6"/>
+        </w:pBdr>
+        <w:shd w:fill="F2F2F2" w:color="auto" w:val="clear"/>
+        <w:spacing w:after="0" w:before="0" w:line="240"/>
+        <w:ind w:left="120"/>
+      </w:pPr>
+      <w:r>
+        <w:rPr>
+          <w:rFonts w:ascii="Consolas" w:cs="Consolas" w:eastAsia="Consolas" w:hAnsi="Consolas"/>
+          <w:sz w:val="17"/>
+          <w:szCs w:val="17"/>
+        </w:rPr>
+        <w:t xml:space="preserve">  &lt;/content&gt;</w:t>
+      </w:r>
+    </w:p>
+    <w:p>
+      <w:pPr>
+        <w:pBdr>
+          <w:left w:val="single" w:color="1F4E79" w:sz="12" w:space="6"/>
+        </w:pBdr>
+        <w:shd w:fill="F2F2F2" w:color="auto" w:val="clear"/>
+        <w:spacing w:after="0" w:before="0" w:line="240"/>
+        <w:ind w:left="120"/>
+      </w:pPr>
+      <w:r>
+        <w:rPr>
+          <w:rFonts w:ascii="Consolas" w:cs="Consolas" w:eastAsia="Consolas" w:hAnsi="Consolas"/>
+          <w:sz w:val="17"/>
+          <w:szCs w:val="17"/>
+        </w:rPr>
+        <w:t xml:space="preserve">&lt;/entry&gt;</w:t>
+      </w:r>
+    </w:p>
+    <w:p>
+      <w:pPr>
+        <w:pBdr>
+          <w:left w:val="single" w:color="1F4E79" w:sz="12" w:space="6"/>
+        </w:pBdr>
+        <w:shd w:fill="F2F2F2" w:color="auto" w:val="clear"/>
+        <w:spacing w:after="0" w:before="0" w:line="240"/>
+        <w:ind w:left="120"/>
+      </w:pPr>
+      <w:r>
+        <w:rPr>
+          <w:rFonts w:ascii="Consolas" w:cs="Consolas" w:eastAsia="Consolas" w:hAnsi="Consolas"/>
+          <w:sz w:val="17"/>
+          <w:szCs w:val="17"/>
+        </w:rPr>
+        <w:t xml:space="preserve"> </w:t>
+      </w:r>
+    </w:p>
+    <w:p>
+      <w:pPr>
+        <w:pBdr>
+          <w:left w:val="single" w:color="1F4E79" w:sz="12" w:space="6"/>
+        </w:pBdr>
+        <w:shd w:fill="F2F2F2" w:color="auto" w:val="clear"/>
+        <w:spacing w:after="0" w:before="0" w:line="240"/>
+        <w:ind w:left="120"/>
+      </w:pPr>
+      <w:r>
+        <w:rPr>
+          <w:rFonts w:ascii="Consolas" w:cs="Consolas" w:eastAsia="Consolas" w:hAnsi="Consolas"/>
+          <w:sz w:val="17"/>
+          <w:szCs w:val="17"/>
+        </w:rPr>
+        <w:t xml:space="preserve">Read the result with XPath (namespaces m / d as above):</w:t>
+      </w:r>
+    </w:p>
+    <w:p>
+      <w:pPr>
+        <w:pBdr>
+          <w:left w:val="single" w:color="1F4E79" w:sz="12" w:space="6"/>
+        </w:pBdr>
+        <w:shd w:fill="F2F2F2" w:color="auto" w:val="clear"/>
+        <w:spacing w:after="0" w:before="0" w:line="240"/>
+        <w:ind w:left="120"/>
+      </w:pPr>
+      <w:r>
+        <w:rPr>
+          <w:rFonts w:ascii="Consolas" w:cs="Consolas" w:eastAsia="Consolas" w:hAnsi="Consolas"/>
+          <w:sz w:val="17"/>
+          <w:szCs w:val="17"/>
+        </w:rPr>
+        <w:t xml:space="preserve">  //m:properties/d:STATUS     S = success</w:t>
+      </w:r>
+    </w:p>
+    <w:p>
+      <w:pPr>
+        <w:pBdr>
+          <w:left w:val="single" w:color="1F4E79" w:sz="12" w:space="6"/>
+        </w:pBdr>
+        <w:shd w:fill="F2F2F2" w:color="auto" w:val="clear"/>
+        <w:spacing w:after="0" w:before="0" w:line="240"/>
+        <w:ind w:left="120"/>
+      </w:pPr>
+      <w:r>
+        <w:rPr>
+          <w:rFonts w:ascii="Consolas" w:cs="Consolas" w:eastAsia="Consolas" w:hAnsi="Consolas"/>
+          <w:sz w:val="17"/>
+          <w:szCs w:val="17"/>
+        </w:rPr>
+        <w:t xml:space="preserve">  //m:properties/d:ACTION     CREATE / UPDATE</w:t>
+      </w:r>
+    </w:p>
+    <w:p>
+      <w:pPr>
+        <w:pBdr>
+          <w:left w:val="single" w:color="1F4E79" w:sz="12" w:space="6"/>
+        </w:pBdr>
+        <w:shd w:fill="F2F2F2" w:color="auto" w:val="clear"/>
+        <w:spacing w:after="0" w:before="0" w:line="240"/>
+        <w:ind w:left="120"/>
+      </w:pPr>
+      <w:r>
+        <w:rPr>
+          <w:rFonts w:ascii="Consolas" w:cs="Consolas" w:eastAsia="Consolas" w:hAnsi="Consolas"/>
+          <w:sz w:val="17"/>
+          <w:szCs w:val="17"/>
+        </w:rPr>
+        <w:t xml:space="preserve">  //m:properties/d:MESSAGE    result text</w:t>
+      </w:r>
+    </w:p>
+    <w:p>
+      <w:pPr>
+        <w:pBdr>
+          <w:left w:val="single" w:color="1F4E79" w:sz="12" w:space="6"/>
+        </w:pBdr>
+        <w:shd w:fill="F2F2F2" w:color="auto" w:val="clear"/>
+        <w:spacing w:after="0" w:before="0" w:line="240"/>
+        <w:ind w:left="120"/>
+      </w:pPr>
+      <w:r>
+        <w:rPr>
+          <w:rFonts w:ascii="Consolas" w:cs="Consolas" w:eastAsia="Consolas" w:hAnsi="Consolas"/>
+          <w:sz w:val="17"/>
+          <w:szCs w:val="17"/>
+        </w:rPr>
+        <w:t xml:space="preserve">  //m:properties/d:LIFNR      OVL vendor number (with leading zeros)</w:t>
+      </w:r>
+    </w:p>
+    <w:p>
+      <w:pPr>
+        <w:pBdr>
+          <w:left w:val="single" w:color="1F4E79" w:sz="12" w:space="6"/>
+        </w:pBdr>
+        <w:shd w:fill="F2F2F2" w:color="auto" w:val="clear"/>
+        <w:spacing w:after="0" w:before="0" w:line="240"/>
+        <w:ind w:left="120"/>
+      </w:pPr>
+      <w:r>
+        <w:rPr>
+          <w:rFonts w:ascii="Consolas" w:cs="Consolas" w:eastAsia="Consolas" w:hAnsi="Consolas"/>
+          <w:sz w:val="17"/>
+          <w:szCs w:val="17"/>
+        </w:rPr>
+        <w:t xml:space="preserve">After the OData V2 receiver adapter converts the response, the same fields</w:t>
       </w:r>
     </w:p>
     <w:p>
@@ -5312,7 +5780,7 @@
           <w:sz w:val="17"/>
           <w:szCs w:val="17"/>
         </w:rPr>
-        <w:t xml:space="preserve">         "MESSAGE": "Vendor 712345 created in company code OVL." } }</w:t>
+        <w:t xml:space="preserve">are available as /VendorSet/Vendor/STATUS, /ACTION, /MESSAGE.</w:t>
       </w:r>
     </w:p>
     <w:p>
@@ -5338,61 +5806,169 @@
           <w:sz w:val="17"/>
           <w:szCs w:val="17"/>
         </w:rPr>
-        <w:t xml:space="preserve">HTTP 400 Bad Request</w:t>
-      </w:r>
-    </w:p>
-    <w:p>
-      <w:pPr>
-        <w:pBdr>
-          <w:left w:val="single" w:color="1F4E79" w:sz="12" w:space="6"/>
-        </w:pBdr>
-        <w:shd w:fill="F2F2F2" w:color="auto" w:val="clear"/>
-        <w:spacing w:after="0" w:before="0" w:line="240"/>
-        <w:ind w:left="120"/>
-      </w:pPr>
-      <w:r>
-        <w:rPr>
-          <w:rFonts w:ascii="Consolas" w:cs="Consolas" w:eastAsia="Consolas" w:hAnsi="Consolas"/>
-          <w:sz w:val="17"/>
-          <w:szCs w:val="17"/>
-        </w:rPr>
-        <w:t xml:space="preserve">{ "error": { "code": "00/001",</w:t>
-      </w:r>
-    </w:p>
-    <w:p>
-      <w:pPr>
-        <w:pBdr>
-          <w:left w:val="single" w:color="1F4E79" w:sz="12" w:space="6"/>
-        </w:pBdr>
-        <w:shd w:fill="F2F2F2" w:color="auto" w:val="clear"/>
-        <w:spacing w:after="0" w:before="0" w:line="240"/>
-        <w:ind w:left="120"/>
-      </w:pPr>
-      <w:r>
-        <w:rPr>
-          <w:rFonts w:ascii="Consolas" w:cs="Consolas" w:eastAsia="Consolas" w:hAnsi="Consolas"/>
-          <w:sz w:val="17"/>
-          <w:szCs w:val="17"/>
-        </w:rPr>
-        <w:t xml:space="preserve">             "message": { "lang": "en",</w:t>
-      </w:r>
-    </w:p>
-    <w:p>
-      <w:pPr>
-        <w:pBdr>
-          <w:left w:val="single" w:color="1F4E79" w:sz="12" w:space="6"/>
-        </w:pBdr>
-        <w:shd w:fill="F2F2F2" w:color="auto" w:val="clear"/>
-        <w:spacing w:after="0" w:before="0" w:line="240"/>
-        <w:ind w:left="120"/>
-      </w:pPr>
-      <w:r>
-        <w:rPr>
-          <w:rFonts w:ascii="Consolas" w:cs="Consolas" w:eastAsia="Consolas" w:hAnsi="Consolas"/>
-          <w:sz w:val="17"/>
-          <w:szCs w:val="17"/>
-        </w:rPr>
-        <w:t xml:space="preserve">               "value": "Bank key IN/XXXX0000000 does not exist in OVL (maintain in FI01)." },</w:t>
+        <w:t xml:space="preserve">HTTP 400 Bad Request   (Content-Type: application/xml)</w:t>
+      </w:r>
+    </w:p>
+    <w:p>
+      <w:pPr>
+        <w:pBdr>
+          <w:left w:val="single" w:color="1F4E79" w:sz="12" w:space="6"/>
+        </w:pBdr>
+        <w:shd w:fill="F2F2F2" w:color="auto" w:val="clear"/>
+        <w:spacing w:after="0" w:before="0" w:line="240"/>
+        <w:ind w:left="120"/>
+      </w:pPr>
+      <w:r>
+        <w:rPr>
+          <w:rFonts w:ascii="Consolas" w:cs="Consolas" w:eastAsia="Consolas" w:hAnsi="Consolas"/>
+          <w:sz w:val="17"/>
+          <w:szCs w:val="17"/>
+        </w:rPr>
+        <w:t xml:space="preserve"> </w:t>
+      </w:r>
+    </w:p>
+    <w:p>
+      <w:pPr>
+        <w:pBdr>
+          <w:left w:val="single" w:color="1F4E79" w:sz="12" w:space="6"/>
+        </w:pBdr>
+        <w:shd w:fill="F2F2F2" w:color="auto" w:val="clear"/>
+        <w:spacing w:after="0" w:before="0" w:line="240"/>
+        <w:ind w:left="120"/>
+      </w:pPr>
+      <w:r>
+        <w:rPr>
+          <w:rFonts w:ascii="Consolas" w:cs="Consolas" w:eastAsia="Consolas" w:hAnsi="Consolas"/>
+          <w:sz w:val="17"/>
+          <w:szCs w:val="17"/>
+        </w:rPr>
+        <w:t xml:space="preserve">&lt;error xmlns="http://schemas.microsoft.com/ado/2007/08/dataservices/metadata"&gt;</w:t>
+      </w:r>
+    </w:p>
+    <w:p>
+      <w:pPr>
+        <w:pBdr>
+          <w:left w:val="single" w:color="1F4E79" w:sz="12" w:space="6"/>
+        </w:pBdr>
+        <w:shd w:fill="F2F2F2" w:color="auto" w:val="clear"/>
+        <w:spacing w:after="0" w:before="0" w:line="240"/>
+        <w:ind w:left="120"/>
+      </w:pPr>
+      <w:r>
+        <w:rPr>
+          <w:rFonts w:ascii="Consolas" w:cs="Consolas" w:eastAsia="Consolas" w:hAnsi="Consolas"/>
+          <w:sz w:val="17"/>
+          <w:szCs w:val="17"/>
+        </w:rPr>
+        <w:t xml:space="preserve">  &lt;code&gt;00/001&lt;/code&gt;</w:t>
+      </w:r>
+    </w:p>
+    <w:p>
+      <w:pPr>
+        <w:pBdr>
+          <w:left w:val="single" w:color="1F4E79" w:sz="12" w:space="6"/>
+        </w:pBdr>
+        <w:shd w:fill="F2F2F2" w:color="auto" w:val="clear"/>
+        <w:spacing w:after="0" w:before="0" w:line="240"/>
+        <w:ind w:left="120"/>
+      </w:pPr>
+      <w:r>
+        <w:rPr>
+          <w:rFonts w:ascii="Consolas" w:cs="Consolas" w:eastAsia="Consolas" w:hAnsi="Consolas"/>
+          <w:sz w:val="17"/>
+          <w:szCs w:val="17"/>
+        </w:rPr>
+        <w:t xml:space="preserve">  &lt;message xml:lang="en"&gt;Bank key IN/XXXX0000000 does not exist in OVL (maintain in FI01).&lt;/message&gt;</w:t>
+      </w:r>
+    </w:p>
+    <w:p>
+      <w:pPr>
+        <w:pBdr>
+          <w:left w:val="single" w:color="1F4E79" w:sz="12" w:space="6"/>
+        </w:pBdr>
+        <w:shd w:fill="F2F2F2" w:color="auto" w:val="clear"/>
+        <w:spacing w:after="0" w:before="0" w:line="240"/>
+        <w:ind w:left="120"/>
+      </w:pPr>
+      <w:r>
+        <w:rPr>
+          <w:rFonts w:ascii="Consolas" w:cs="Consolas" w:eastAsia="Consolas" w:hAnsi="Consolas"/>
+          <w:sz w:val="17"/>
+          <w:szCs w:val="17"/>
+        </w:rPr>
+        <w:t xml:space="preserve">  &lt;innererror&gt; ... &lt;errordetails&gt; ... all messages ... &lt;/errordetails&gt; &lt;/innererror&gt;</w:t>
+      </w:r>
+    </w:p>
+    <w:p>
+      <w:pPr>
+        <w:pBdr>
+          <w:left w:val="single" w:color="1F4E79" w:sz="12" w:space="6"/>
+        </w:pBdr>
+        <w:shd w:fill="F2F2F2" w:color="auto" w:val="clear"/>
+        <w:spacing w:after="0" w:before="0" w:line="240"/>
+        <w:ind w:left="120"/>
+      </w:pPr>
+      <w:r>
+        <w:rPr>
+          <w:rFonts w:ascii="Consolas" w:cs="Consolas" w:eastAsia="Consolas" w:hAnsi="Consolas"/>
+          <w:sz w:val="17"/>
+          <w:szCs w:val="17"/>
+        </w:rPr>
+        <w:t xml:space="preserve">&lt;/error&gt;</w:t>
+      </w:r>
+    </w:p>
+    <w:p>
+      <w:pPr>
+        <w:pBdr>
+          <w:left w:val="single" w:color="1F4E79" w:sz="12" w:space="6"/>
+        </w:pBdr>
+        <w:shd w:fill="F2F2F2" w:color="auto" w:val="clear"/>
+        <w:spacing w:after="0" w:before="0" w:line="240"/>
+        <w:ind w:left="120"/>
+      </w:pPr>
+      <w:r>
+        <w:rPr>
+          <w:rFonts w:ascii="Consolas" w:cs="Consolas" w:eastAsia="Consolas" w:hAnsi="Consolas"/>
+          <w:sz w:val="17"/>
+          <w:szCs w:val="17"/>
+        </w:rPr>
+        <w:t xml:space="preserve"> </w:t>
+      </w:r>
+    </w:p>
+    <w:p>
+      <w:pPr>
+        <w:pBdr>
+          <w:left w:val="single" w:color="1F4E79" w:sz="12" w:space="6"/>
+        </w:pBdr>
+        <w:shd w:fill="F2F2F2" w:color="auto" w:val="clear"/>
+        <w:spacing w:after="0" w:before="0" w:line="240"/>
+        <w:ind w:left="120"/>
+      </w:pPr>
+      <w:r>
+        <w:rPr>
+          <w:rFonts w:ascii="Consolas" w:cs="Consolas" w:eastAsia="Consolas" w:hAnsi="Consolas"/>
+          <w:sz w:val="17"/>
+          <w:szCs w:val="17"/>
+        </w:rPr>
+        <w:t xml:space="preserve">In CPI the receiver raises an exception -&gt; Exception Subprocess:</w:t>
+      </w:r>
+    </w:p>
+    <w:p>
+      <w:pPr>
+        <w:pBdr>
+          <w:left w:val="single" w:color="1F4E79" w:sz="12" w:space="6"/>
+        </w:pBdr>
+        <w:shd w:fill="F2F2F2" w:color="auto" w:val="clear"/>
+        <w:spacing w:after="0" w:before="0" w:line="240"/>
+        <w:ind w:left="120"/>
+      </w:pPr>
+      <w:r>
+        <w:rPr>
+          <w:rFonts w:ascii="Consolas" w:cs="Consolas" w:eastAsia="Consolas" w:hAnsi="Consolas"/>
+          <w:sz w:val="17"/>
+          <w:szCs w:val="17"/>
+        </w:rPr>
+        <w:t xml:space="preserve">  ${exception.message}       contains the message text</w:t>
       </w:r>
     </w:p>
     <w:p>
@@ -5410,7 +5986,7 @@
           <w:sz w:val="17"/>
           <w:szCs w:val="17"/>
         </w:rPr>
-        <w:t xml:space="preserve">             "innererror": { "errordetails": [ ... all messages ... ] } } }</w:t>
+        <w:t xml:space="preserve">  ${exception.responseBody}  contains the &lt;error&gt; XML above</w:t>
       </w:r>
     </w:p>
     <w:tbl>

</xml_diff>